<commit_message>
Add README with screenshots and updated task report
</commit_message>
<xml_diff>
--- a/GDG_Flutter_Task_Report_Muhammad_Abdul_Hanan.docx
+++ b/GDG_Flutter_Task_Report_Muhammad_Abdul_Hanan.docx
@@ -184,6 +184,30 @@
       </w:r>
     </w:p>
     <w:p>
+      <w:pPr>
+        <w:tabs>
+          <w:tab w:val="left" w:pos="3400"/>
+        </w:tabs>
+        <w:spacing w:after="140"/>
+      </w:pPr>
+      <w:r>
+        <w:rPr>
+          <w:b/>
+          <w:bCs/>
+          <w:sz w:val="26"/>
+          <w:szCs w:val="26"/>
+        </w:rPr>
+        <w:t xml:space="preserve">GitHub:</w:t>
+      </w:r>
+      <w:r>
+        <w:rPr>
+          <w:sz w:val="26"/>
+          <w:szCs w:val="26"/>
+        </w:rPr>
+        <w:t xml:space="preserve">	github.com/hanova-dev/GDG-Task-Profile-App-</w:t>
+      </w:r>
+    </w:p>
+    <w:p>
       <w:r>
         <w:br w:type="page"/>
       </w:r>
@@ -249,6 +273,28 @@
           <w:szCs w:val="24"/>
         </w:rPr>
         <w:t xml:space="preserve">Flutter, Dart, Android Studio and the Pixel 7a Android emulator.</w:t>
+      </w:r>
+    </w:p>
+    <w:p>
+      <w:pPr>
+        <w:spacing w:after="120" w:line="300"/>
+        <w:jc w:val="both"/>
+      </w:pPr>
+      <w:r>
+        <w:rPr>
+          <w:b/>
+          <w:bCs/>
+          <w:sz w:val="24"/>
+          <w:szCs w:val="24"/>
+        </w:rPr>
+        <w:t xml:space="preserve">GitHub Repository: </w:t>
+      </w:r>
+      <w:r>
+        <w:rPr>
+          <w:sz w:val="24"/>
+          <w:szCs w:val="24"/>
+        </w:rPr>
+        <w:t xml:space="preserve">https://github.com/hanova-dev/GDG-Task-Profile-App-</w:t>
       </w:r>
     </w:p>
     <w:p>

</xml_diff>